<commit_message>
feat: to allow the automatic generation of agreement certificates with outstanding compensation.
</commit_message>
<xml_diff>
--- a/resources/templates/certificado_convenio_subsidio_vivienda_template.docx
+++ b/resources/templates/certificado_convenio_subsidio_vivienda_template.docx
@@ -27,7 +27,7 @@
           <w:noProof/>
           <w:lang w:val="es-419" w:eastAsia="es-419"/>
         </w:rPr>
-        <w:pict w14:anchorId="725E8B4A">
+        <w:pict w14:anchorId="2FC98A0F">
           <v:shapetype id="_x0000_t201" coordsize="21600,21600" o:spt="201" path="m,l,21600r21600,l21600,xe">
             <v:stroke joinstyle="miter"/>
             <v:path shadowok="f" o:extrusionok="f" strokeok="f" fillok="f" o:connecttype="rect"/>
@@ -50,6 +50,8 @@
       <w:r>
         <w:rPr>
           <w:rFonts w:asciiTheme="minorHAnsi" w:hAnsiTheme="minorHAnsi" w:cstheme="minorHAnsi"/>
+          <w:i/>
+          <w:iCs/>
         </w:rPr>
         <w:t>${FECHA_CERTIFICADO}</w:t>
       </w:r>
@@ -163,6 +165,8 @@
         <w:rPr>
           <w:b/>
           <w:bCs/>
+          <w:i/>
+          <w:iCs/>
           <w:sz w:val="24"/>
           <w:szCs w:val="24"/>
         </w:rPr>
@@ -182,6 +186,8 @@
       <w:r>
         <w:rPr>
           <w:rFonts w:asciiTheme="minorHAnsi" w:hAnsiTheme="minorHAnsi" w:cstheme="minorHAnsi"/>
+          <w:i/>
+          <w:iCs/>
         </w:rPr>
         <w:t>Medellín - Antioquia</w:t>
       </w:r>
@@ -298,6 +304,8 @@
           <w:rFonts w:asciiTheme="minorHAnsi" w:hAnsiTheme="minorHAnsi" w:cstheme="minorHAnsi"/>
           <w:b/>
           <w:bCs/>
+          <w:i/>
+          <w:iCs/>
         </w:rPr>
       </w:pPr>
       <w:r>
@@ -575,9 +583,22 @@
           <w:i/>
           <w:iCs/>
         </w:rPr>
-        <w:t>${SE_ENCUENTRA_ESTUVO}</w:t>
-      </w:r>
-      <w:r>
+        <w:t xml:space="preserve">${SE_ENCUENTRA_ESTUVO} </w:t>
+      </w:r>
+      <w:r>
+        <w:rPr>
+          <w:rFonts w:asciiTheme="minorHAnsi" w:hAnsiTheme="minorHAnsi" w:cstheme="minorHAnsi"/>
+          <w:i/>
+          <w:iCs/>
+        </w:rPr>
+        <w:t>afiliada</w:t>
+      </w:r>
+      <w:r>
+        <w:rPr>
+          <w:rFonts w:asciiTheme="minorHAnsi" w:hAnsiTheme="minorHAnsi" w:cstheme="minorHAnsi"/>
+          <w:i/>
+          <w:iCs/>
+        </w:rPr>
         <w:t xml:space="preserve"> </w:t>
       </w:r>
       <w:r>
@@ -586,7 +607,88 @@
           <w:i/>
           <w:iCs/>
         </w:rPr>
-        <w:t>afiliada</w:t>
+        <w:fldChar w:fldCharType="begin"/>
+      </w:r>
+      <w:r>
+        <w:rPr>
+          <w:rFonts w:asciiTheme="minorHAnsi" w:hAnsiTheme="minorHAnsi" w:cstheme="minorHAnsi"/>
+          <w:i/>
+          <w:iCs/>
+        </w:rPr>
+        <w:instrText xml:space="preserve"> IF </w:instrText>
+      </w:r>
+      <w:r>
+        <w:rPr>
+          <w:rFonts w:asciiTheme="minorHAnsi" w:hAnsiTheme="minorHAnsi" w:cstheme="minorHAnsi"/>
+          <w:i/>
+          <w:iCs/>
+        </w:rPr>
+        <w:fldChar w:fldCharType="begin"/>
+      </w:r>
+      <w:r>
+        <w:rPr>
+          <w:rFonts w:asciiTheme="minorHAnsi" w:hAnsiTheme="minorHAnsi" w:cstheme="minorHAnsi"/>
+          <w:i/>
+          <w:iCs/>
+        </w:rPr>
+        <w:instrText xml:space="preserve"> MERGEFIELD SEXO </w:instrText>
+      </w:r>
+      <w:r>
+        <w:rPr>
+          <w:rFonts w:asciiTheme="minorHAnsi" w:hAnsiTheme="minorHAnsi" w:cstheme="minorHAnsi"/>
+          <w:i/>
+          <w:iCs/>
+        </w:rPr>
+        <w:fldChar w:fldCharType="separate"/>
+      </w:r>
+      <w:r>
+        <w:rPr>
+          <w:rFonts w:asciiTheme="minorHAnsi" w:hAnsiTheme="minorHAnsi" w:cstheme="minorHAnsi"/>
+          <w:i/>
+          <w:iCs/>
+          <w:noProof/>
+        </w:rPr>
+        <w:instrText>M</w:instrText>
+      </w:r>
+      <w:r>
+        <w:rPr>
+          <w:rFonts w:asciiTheme="minorHAnsi" w:hAnsiTheme="minorHAnsi" w:cstheme="minorHAnsi"/>
+          <w:i/>
+          <w:iCs/>
+        </w:rPr>
+        <w:fldChar w:fldCharType="end"/>
+      </w:r>
+      <w:r>
+        <w:rPr>
+          <w:rFonts w:asciiTheme="minorHAnsi" w:hAnsiTheme="minorHAnsi" w:cstheme="minorHAnsi"/>
+          <w:i/>
+          <w:iCs/>
+        </w:rPr>
+        <w:instrText xml:space="preserve"> = "F" "afiliada" "" </w:instrText>
+      </w:r>
+      <w:r>
+        <w:rPr>
+          <w:rFonts w:asciiTheme="minorHAnsi" w:hAnsiTheme="minorHAnsi" w:cstheme="minorHAnsi"/>
+          <w:i/>
+          <w:iCs/>
+        </w:rPr>
+        <w:fldChar w:fldCharType="end"/>
+      </w:r>
+      <w:r>
+        <w:rPr>
+          <w:rFonts w:asciiTheme="minorHAnsi" w:hAnsiTheme="minorHAnsi" w:cstheme="minorHAnsi"/>
+          <w:i/>
+          <w:iCs/>
+        </w:rPr>
+        <w:t>al Sindicato</w:t>
+      </w:r>
+      <w:r>
+        <w:rPr>
+          <w:rFonts w:asciiTheme="minorHAnsi" w:hAnsiTheme="minorHAnsi" w:cstheme="minorHAnsi"/>
+          <w:i/>
+          <w:iCs/>
+        </w:rPr>
+        <w:t>,</w:t>
       </w:r>
       <w:r>
         <w:rPr>
@@ -602,112 +704,7 @@
           <w:i/>
           <w:iCs/>
         </w:rPr>
-        <w:fldChar w:fldCharType="begin"/>
-      </w:r>
-      <w:r>
-        <w:rPr>
-          <w:rFonts w:asciiTheme="minorHAnsi" w:hAnsiTheme="minorHAnsi" w:cstheme="minorHAnsi"/>
-          <w:i/>
-          <w:iCs/>
-        </w:rPr>
-        <w:instrText xml:space="preserve"> IF </w:instrText>
-      </w:r>
-      <w:r>
-        <w:rPr>
-          <w:rFonts w:asciiTheme="minorHAnsi" w:hAnsiTheme="minorHAnsi" w:cstheme="minorHAnsi"/>
-          <w:i/>
-          <w:iCs/>
-        </w:rPr>
-        <w:fldChar w:fldCharType="begin"/>
-      </w:r>
-      <w:r>
-        <w:rPr>
-          <w:rFonts w:asciiTheme="minorHAnsi" w:hAnsiTheme="minorHAnsi" w:cstheme="minorHAnsi"/>
-          <w:i/>
-          <w:iCs/>
-        </w:rPr>
-        <w:instrText xml:space="preserve"> MERGEFIELD SEXO </w:instrText>
-      </w:r>
-      <w:r>
-        <w:rPr>
-          <w:rFonts w:asciiTheme="minorHAnsi" w:hAnsiTheme="minorHAnsi" w:cstheme="minorHAnsi"/>
-          <w:i/>
-          <w:iCs/>
-        </w:rPr>
-        <w:fldChar w:fldCharType="separate"/>
-      </w:r>
-      <w:r>
-        <w:rPr>
-          <w:rFonts w:asciiTheme="minorHAnsi" w:hAnsiTheme="minorHAnsi" w:cstheme="minorHAnsi"/>
-          <w:i/>
-          <w:iCs/>
-          <w:noProof/>
-        </w:rPr>
-        <w:instrText>M</w:instrText>
-      </w:r>
-      <w:r>
-        <w:rPr>
-          <w:rFonts w:asciiTheme="minorHAnsi" w:hAnsiTheme="minorHAnsi" w:cstheme="minorHAnsi"/>
-          <w:i/>
-          <w:iCs/>
-        </w:rPr>
-        <w:fldChar w:fldCharType="end"/>
-      </w:r>
-      <w:r>
-        <w:rPr>
-          <w:rFonts w:asciiTheme="minorHAnsi" w:hAnsiTheme="minorHAnsi" w:cstheme="minorHAnsi"/>
-          <w:i/>
-          <w:iCs/>
-        </w:rPr>
-        <w:instrText xml:space="preserve"> = "F" "afiliada" "" </w:instrText>
-      </w:r>
-      <w:r>
-        <w:rPr>
-          <w:rFonts w:asciiTheme="minorHAnsi" w:hAnsiTheme="minorHAnsi" w:cstheme="minorHAnsi"/>
-          <w:i/>
-          <w:iCs/>
-        </w:rPr>
-        <w:fldChar w:fldCharType="end"/>
-      </w:r>
-      <w:r>
-        <w:rPr>
-          <w:rFonts w:asciiTheme="minorHAnsi" w:hAnsiTheme="minorHAnsi" w:cstheme="minorHAnsi"/>
-          <w:i/>
-          <w:iCs/>
-        </w:rPr>
-        <w:t>al Sindicato</w:t>
-      </w:r>
-      <w:r>
-        <w:rPr>
-          <w:rFonts w:asciiTheme="minorHAnsi" w:hAnsiTheme="minorHAnsi" w:cstheme="minorHAnsi"/>
-          <w:i/>
-          <w:iCs/>
-        </w:rPr>
-        <w:t>,</w:t>
-      </w:r>
-      <w:r>
-        <w:rPr>
-          <w:rFonts w:asciiTheme="minorHAnsi" w:hAnsiTheme="minorHAnsi" w:cstheme="minorHAnsi"/>
-          <w:i/>
-          <w:iCs/>
-        </w:rPr>
-        <w:t xml:space="preserve"> </w:t>
-      </w:r>
-      <w:r>
-        <w:rPr>
-          <w:rFonts w:asciiTheme="minorHAnsi" w:hAnsiTheme="minorHAnsi" w:cstheme="minorHAnsi"/>
-          <w:i/>
-          <w:iCs/>
-        </w:rPr>
-        <w:t>a</w:t>
-      </w:r>
-      <w:r>
-        <w:rPr>
-          <w:rFonts w:asciiTheme="minorHAnsi" w:hAnsiTheme="minorHAnsi" w:cstheme="minorHAnsi"/>
-          <w:i/>
-          <w:iCs/>
-        </w:rPr>
-        <w:t xml:space="preserve"> través de</w:t>
+        <w:t>a través de</w:t>
       </w:r>
       <w:r>
         <w:rPr>
@@ -727,6 +724,10 @@
         <w:t>${UN_CONVENIO_VARIOS_CONVENIOS}</w:t>
       </w:r>
       <w:r>
+        <w:rPr>
+          <w:i/>
+          <w:iCs/>
+        </w:rPr>
         <w:t xml:space="preserve"> </w:t>
       </w:r>
       <w:r>
@@ -897,6 +898,8 @@
           <w:rFonts w:asciiTheme="minorHAnsi" w:hAnsiTheme="minorHAnsi" w:cstheme="minorHAnsi"/>
           <w:b/>
           <w:bCs/>
+          <w:i/>
+          <w:iCs/>
         </w:rPr>
         <w:t>${</w:t>
       </w:r>
@@ -914,6 +917,8 @@
           <w:rFonts w:asciiTheme="minorHAnsi" w:hAnsiTheme="minorHAnsi" w:cstheme="minorHAnsi"/>
           <w:b/>
           <w:bCs/>
+          <w:i/>
+          <w:iCs/>
         </w:rPr>
         <w:t>}</w:t>
       </w:r>
@@ -1062,6 +1067,10 @@
         <w:t xml:space="preserve">En calidad de </w:t>
       </w:r>
       <w:r>
+        <w:rPr>
+          <w:i/>
+          <w:iCs/>
+        </w:rPr>
         <w:t xml:space="preserve">persona afiliada </w:t>
       </w:r>
       <w:r>
@@ -2951,15 +2960,7 @@
           <w:i/>
           <w:iCs/>
         </w:rPr>
-        <w:t>.</w:t>
-      </w:r>
-      <w:r>
-        <w:rPr>
-          <w:rFonts w:asciiTheme="minorHAnsi" w:hAnsiTheme="minorHAnsi" w:cstheme="minorHAnsi"/>
-          <w:i/>
-          <w:iCs/>
-        </w:rPr>
-        <w:t xml:space="preserve">  </w:t>
+        <w:t xml:space="preserve">.  </w:t>
       </w:r>
       <w:r>
         <w:rPr>
@@ -3111,14 +3112,7 @@
           <w:iCs/>
           <w:color w:val="000000" w:themeColor="text1"/>
         </w:rPr>
-        <w:instrText>&lt;&gt;"" "</w:instrText>
-      </w:r>
-      <w:r>
-        <w:rPr>
-          <w:rFonts w:asciiTheme="minorHAnsi" w:hAnsiTheme="minorHAnsi" w:cstheme="minorHAnsi"/>
-          <w:color w:val="000000" w:themeColor="text1"/>
-        </w:rPr>
-        <w:instrText xml:space="preserve"> </w:instrText>
+        <w:instrText xml:space="preserve">&lt;&gt;"" " </w:instrText>
       </w:r>
       <w:r>
         <w:rPr>

</xml_diff>